<commit_message>
Prepare anonymous peer-review copy
</commit_message>
<xml_diff>
--- a/Materials/Full_Survey_English_Version.docx
+++ b/Materials/Full_Survey_English_Version.docx
@@ -13993,7 +13993,7 @@
           <w:rFonts w:ascii="Times New Roman" w:eastAsia="Times New Roman" w:hAnsi="Times New Roman" w:cs="Times New Roman"/>
           <w:color w:val="FF0000"/>
         </w:rPr>
-        <w:t>aistat.learning.lab@gmail.com</w:t>
+        <w:t>[email withheld for anonymous review]</w:t>
       </w:r>
       <w:r>
         <w:rPr>
@@ -18629,7 +18629,7 @@
           <w:rFonts w:ascii="Times New Roman" w:eastAsia="Times New Roman" w:hAnsi="Times New Roman" w:cs="Times New Roman"/>
           <w:color w:val="FF0000"/>
         </w:rPr>
-        <w:t>aistat.learning.lab@gmail.com.</w:t>
+        <w:t>[email withheld for anonymous review].</w:t>
       </w:r>
     </w:p>
     <w:p>

</xml_diff>